<commit_message>
VIF-screened full-controls sensitivity, Connecticut FIPS fallback, EHP cover letter and manuscript updates
Co-Authored-By: Tatsuki Onishi <bougtoir@gmail.com>
</commit_message>
<xml_diff>
--- a/output/manuscript/ehp_cover_letter.docx
+++ b/output/manuscript/ehp_cover_letter.docx
@@ -23,7 +23,7 @@
         <w:spacing w:line="276" w:lineRule="auto" w:after="120"/>
       </w:pPr>
       <w:r>
-        <w:t>Dear Editors,</w:t>
+        <w:t>Dear Editor-in-Chief,</w:t>
       </w:r>
     </w:p>
     <w:p>
@@ -39,7 +39,7 @@
         <w:spacing w:line="276" w:lineRule="auto" w:after="120"/>
       </w:pPr>
       <w:r>
-        <w:t>Statement of Contribution and Environmental-Health Significance: Ambient heat is a well-established environmental exposure that increases all-cause and cardiovascular mortality, but its contribution to fatal road traffic crashes has been largely overlooked. Using only public data, this ecological time-series study shows that days hotter than the local seasonal norm carry an acute, same-day excess of US traffic-crash deaths. The excess survives adjustment for aggregate driving activity and remains after further control for state population, state vehicle-miles travelled, precipitation and heat-stress metrics. It is concentrated in heat-exposed open-air road users (motorcyclists, pedestrians and cyclists), and is comparable in magnitude to all officially recorded direct-heat deaths. Because these deaths continue to be coded as ordinary traffic crashes, the heat contribution remains invisible to heat-mortality surveillance and road-safety statistics, suggesting an uncounted environmental-health burden that would grow under continued warming and could be targeted by heat-aware road safety messaging and shared-mobility heat-adaptation measures.</w:t>
+        <w:t>Statement of Contribution and Environmental-Health Significance: Ambient heat is a well-established environmental exposure that increases all-cause and cardiovascular mortality, but its contribution to fatal road traffic crashes has been largely overlooked. Using only public data, this ecological time-series study shows that days hotter than the local seasonal norm carry an acute, same-day excess of US traffic-crash deaths. The excess survives adjustment for aggregate driving activity and remains in a VIF-screened model with state population (log offset) and precipitation retained after iteratively dropping state vehicle-miles travelled and heat-stress metrics (VIF &gt; 5); the heat-stress metrics, tested individually, yield variable cumulative estimates consistent with collinearity. The excess is concentrated in heat-exposed open-air road users (motorcyclists, pedestrians and cyclists), and is comparable in magnitude to all officially recorded direct-heat deaths. Because these deaths continue to be coded as ordinary traffic crashes, the heat contribution remains invisible to heat-mortality surveillance and road-safety statistics, suggesting an uncounted environmental-health burden that would grow under continued warming and could be targeted by heat-aware road safety messaging and shared-mobility heat-adaptation measures.</w:t>
       </w:r>
     </w:p>
     <w:p>

</xml_diff>